<commit_message>
evaluiations of module 2
</commit_message>
<xml_diff>
--- a/MODULE2_EVALUATION_BRIEFING.docx
+++ b/MODULE2_EVALUATION_BRIEFING.docx
@@ -273,6 +273,45 @@
         <w:jc w:val="center"/>
       </w:pPr>
       <w:r>
+        <w:drawing>
+          <wp:inline xmlns:a="http://schemas.openxmlformats.org/drawingml/2006/main" xmlns:pic="http://schemas.openxmlformats.org/drawingml/2006/picture">
+            <wp:extent cx="5486400" cy="2939143"/>
+            <wp:docPr id="1" name="Picture 1"/>
+            <wp:cNvGraphicFramePr>
+              <a:graphicFrameLocks noChangeAspect="1"/>
+            </wp:cNvGraphicFramePr>
+            <a:graphic>
+              <a:graphicData uri="http://schemas.openxmlformats.org/drawingml/2006/picture">
+                <pic:pic>
+                  <pic:nvPicPr>
+                    <pic:cNvPr id="0" name="fig_ablation_1_role_distribution.png"/>
+                    <pic:cNvPicPr/>
+                  </pic:nvPicPr>
+                  <pic:blipFill>
+                    <a:blip r:embed="rId9"/>
+                    <a:stretch>
+                      <a:fillRect/>
+                    </a:stretch>
+                  </pic:blipFill>
+                  <pic:spPr>
+                    <a:xfrm>
+                      <a:off x="0" y="0"/>
+                      <a:ext cx="5486400" cy="2939143"/>
+                    </a:xfrm>
+                    <a:prstGeom prst="rect"/>
+                  </pic:spPr>
+                </pic:pic>
+              </a:graphicData>
+            </a:graphic>
+          </wp:inline>
+        </w:drawing>
+      </w:r>
+    </w:p>
+    <w:p>
+      <w:pPr>
+        <w:jc w:val="center"/>
+      </w:pPr>
+      <w:r>
         <w:rPr>
           <w:i/>
           <w:color w:val="898781"/>
@@ -282,6 +321,45 @@
       </w:r>
     </w:p>
     <w:p/>
+    <w:p>
+      <w:pPr>
+        <w:jc w:val="center"/>
+      </w:pPr>
+      <w:r>
+        <w:drawing>
+          <wp:inline xmlns:a="http://schemas.openxmlformats.org/drawingml/2006/main" xmlns:pic="http://schemas.openxmlformats.org/drawingml/2006/picture">
+            <wp:extent cx="5486400" cy="2547257"/>
+            <wp:docPr id="2" name="Picture 2"/>
+            <wp:cNvGraphicFramePr>
+              <a:graphicFrameLocks noChangeAspect="1"/>
+            </wp:cNvGraphicFramePr>
+            <a:graphic>
+              <a:graphicData uri="http://schemas.openxmlformats.org/drawingml/2006/picture">
+                <pic:pic>
+                  <pic:nvPicPr>
+                    <pic:cNvPr id="0" name="fig_ablation_2_agreement_with_full.png"/>
+                    <pic:cNvPicPr/>
+                  </pic:nvPicPr>
+                  <pic:blipFill>
+                    <a:blip r:embed="rId10"/>
+                    <a:stretch>
+                      <a:fillRect/>
+                    </a:stretch>
+                  </pic:blipFill>
+                  <pic:spPr>
+                    <a:xfrm>
+                      <a:off x="0" y="0"/>
+                      <a:ext cx="5486400" cy="2547257"/>
+                    </a:xfrm>
+                    <a:prstGeom prst="rect"/>
+                  </pic:spPr>
+                </pic:pic>
+              </a:graphicData>
+            </a:graphic>
+          </wp:inline>
+        </w:drawing>
+      </w:r>
+    </w:p>
     <w:p>
       <w:pPr>
         <w:jc w:val="center"/>
@@ -525,6 +603,45 @@
         <w:jc w:val="center"/>
       </w:pPr>
       <w:r>
+        <w:drawing>
+          <wp:inline xmlns:a="http://schemas.openxmlformats.org/drawingml/2006/main" xmlns:pic="http://schemas.openxmlformats.org/drawingml/2006/picture">
+            <wp:extent cx="5486400" cy="2547257"/>
+            <wp:docPr id="3" name="Picture 3"/>
+            <wp:cNvGraphicFramePr>
+              <a:graphicFrameLocks noChangeAspect="1"/>
+            </wp:cNvGraphicFramePr>
+            <a:graphic>
+              <a:graphicData uri="http://schemas.openxmlformats.org/drawingml/2006/picture">
+                <pic:pic>
+                  <pic:nvPicPr>
+                    <pic:cNvPr id="0" name="fig_ablation_3_mean_distance.png"/>
+                    <pic:cNvPicPr/>
+                  </pic:nvPicPr>
+                  <pic:blipFill>
+                    <a:blip r:embed="rId11"/>
+                    <a:stretch>
+                      <a:fillRect/>
+                    </a:stretch>
+                  </pic:blipFill>
+                  <pic:spPr>
+                    <a:xfrm>
+                      <a:off x="0" y="0"/>
+                      <a:ext cx="5486400" cy="2547257"/>
+                    </a:xfrm>
+                    <a:prstGeom prst="rect"/>
+                  </pic:spPr>
+                </pic:pic>
+              </a:graphicData>
+            </a:graphic>
+          </wp:inline>
+        </w:drawing>
+      </w:r>
+    </w:p>
+    <w:p>
+      <w:pPr>
+        <w:jc w:val="center"/>
+      </w:pPr>
+      <w:r>
         <w:rPr>
           <w:i/>
           <w:color w:val="898781"/>
@@ -539,6 +656,45 @@
         <w:jc w:val="center"/>
       </w:pPr>
       <w:r>
+        <w:drawing>
+          <wp:inline xmlns:a="http://schemas.openxmlformats.org/drawingml/2006/main" xmlns:pic="http://schemas.openxmlformats.org/drawingml/2006/picture">
+            <wp:extent cx="5486400" cy="2547257"/>
+            <wp:docPr id="4" name="Picture 4"/>
+            <wp:cNvGraphicFramePr>
+              <a:graphicFrameLocks noChangeAspect="1"/>
+            </wp:cNvGraphicFramePr>
+            <a:graphic>
+              <a:graphicData uri="http://schemas.openxmlformats.org/drawingml/2006/picture">
+                <pic:pic>
+                  <pic:nvPicPr>
+                    <pic:cNvPr id="0" name="fig_ablation_4_mean_state_score.png"/>
+                    <pic:cNvPicPr/>
+                  </pic:nvPicPr>
+                  <pic:blipFill>
+                    <a:blip r:embed="rId12"/>
+                    <a:stretch>
+                      <a:fillRect/>
+                    </a:stretch>
+                  </pic:blipFill>
+                  <pic:spPr>
+                    <a:xfrm>
+                      <a:off x="0" y="0"/>
+                      <a:ext cx="5486400" cy="2547257"/>
+                    </a:xfrm>
+                    <a:prstGeom prst="rect"/>
+                  </pic:spPr>
+                </pic:pic>
+              </a:graphicData>
+            </a:graphic>
+          </wp:inline>
+        </w:drawing>
+      </w:r>
+    </w:p>
+    <w:p>
+      <w:pPr>
+        <w:jc w:val="center"/>
+      </w:pPr>
+      <w:r>
         <w:rPr>
           <w:i/>
           <w:color w:val="898781"/>
@@ -548,6 +704,45 @@
       </w:r>
     </w:p>
     <w:p/>
+    <w:p>
+      <w:pPr>
+        <w:jc w:val="center"/>
+      </w:pPr>
+      <w:r>
+        <w:drawing>
+          <wp:inline xmlns:a="http://schemas.openxmlformats.org/drawingml/2006/main" xmlns:pic="http://schemas.openxmlformats.org/drawingml/2006/picture">
+            <wp:extent cx="5486400" cy="2547257"/>
+            <wp:docPr id="5" name="Picture 5"/>
+            <wp:cNvGraphicFramePr>
+              <a:graphicFrameLocks noChangeAspect="1"/>
+            </wp:cNvGraphicFramePr>
+            <a:graphic>
+              <a:graphicData uri="http://schemas.openxmlformats.org/drawingml/2006/picture">
+                <pic:pic>
+                  <pic:nvPicPr>
+                    <pic:cNvPr id="0" name="fig_ablation_5_los_hit_rate.png"/>
+                    <pic:cNvPicPr/>
+                  </pic:nvPicPr>
+                  <pic:blipFill>
+                    <a:blip r:embed="rId13"/>
+                    <a:stretch>
+                      <a:fillRect/>
+                    </a:stretch>
+                  </pic:blipFill>
+                  <pic:spPr>
+                    <a:xfrm>
+                      <a:off x="0" y="0"/>
+                      <a:ext cx="5486400" cy="2547257"/>
+                    </a:xfrm>
+                    <a:prstGeom prst="rect"/>
+                  </pic:spPr>
+                </pic:pic>
+              </a:graphicData>
+            </a:graphic>
+          </wp:inline>
+        </w:drawing>
+      </w:r>
+    </w:p>
     <w:p>
       <w:pPr>
         <w:jc w:val="center"/>
@@ -599,6 +794,45 @@
         <w:jc w:val="center"/>
       </w:pPr>
       <w:r>
+        <w:drawing>
+          <wp:inline xmlns:a="http://schemas.openxmlformats.org/drawingml/2006/main" xmlns:pic="http://schemas.openxmlformats.org/drawingml/2006/picture">
+            <wp:extent cx="5486400" cy="3135086"/>
+            <wp:docPr id="6" name="Picture 6"/>
+            <wp:cNvGraphicFramePr>
+              <a:graphicFrameLocks noChangeAspect="1"/>
+            </wp:cNvGraphicFramePr>
+            <a:graphic>
+              <a:graphicData uri="http://schemas.openxmlformats.org/drawingml/2006/picture">
+                <pic:pic>
+                  <pic:nvPicPr>
+                    <pic:cNvPr id="0" name="fig_sensitivity_distance.png"/>
+                    <pic:cNvPicPr/>
+                  </pic:nvPicPr>
+                  <pic:blipFill>
+                    <a:blip r:embed="rId14"/>
+                    <a:stretch>
+                      <a:fillRect/>
+                    </a:stretch>
+                  </pic:blipFill>
+                  <pic:spPr>
+                    <a:xfrm>
+                      <a:off x="0" y="0"/>
+                      <a:ext cx="5486400" cy="3135086"/>
+                    </a:xfrm>
+                    <a:prstGeom prst="rect"/>
+                  </pic:spPr>
+                </pic:pic>
+              </a:graphicData>
+            </a:graphic>
+          </wp:inline>
+        </w:drawing>
+      </w:r>
+    </w:p>
+    <w:p>
+      <w:pPr>
+        <w:jc w:val="center"/>
+      </w:pPr>
+      <w:r>
         <w:rPr>
           <w:i/>
           <w:color w:val="898781"/>
@@ -608,6 +842,45 @@
       </w:r>
     </w:p>
     <w:p/>
+    <w:p>
+      <w:pPr>
+        <w:jc w:val="center"/>
+      </w:pPr>
+      <w:r>
+        <w:drawing>
+          <wp:inline xmlns:a="http://schemas.openxmlformats.org/drawingml/2006/main" xmlns:pic="http://schemas.openxmlformats.org/drawingml/2006/picture">
+            <wp:extent cx="5486400" cy="3135086"/>
+            <wp:docPr id="7" name="Picture 7"/>
+            <wp:cNvGraphicFramePr>
+              <a:graphicFrameLocks noChangeAspect="1"/>
+            </wp:cNvGraphicFramePr>
+            <a:graphic>
+              <a:graphicData uri="http://schemas.openxmlformats.org/drawingml/2006/picture">
+                <pic:pic>
+                  <pic:nvPicPr>
+                    <pic:cNvPr id="0" name="fig_sensitivity_role.png"/>
+                    <pic:cNvPicPr/>
+                  </pic:nvPicPr>
+                  <pic:blipFill>
+                    <a:blip r:embed="rId15"/>
+                    <a:stretch>
+                      <a:fillRect/>
+                    </a:stretch>
+                  </pic:blipFill>
+                  <pic:spPr>
+                    <a:xfrm>
+                      <a:off x="0" y="0"/>
+                      <a:ext cx="5486400" cy="3135086"/>
+                    </a:xfrm>
+                    <a:prstGeom prst="rect"/>
+                  </pic:spPr>
+                </pic:pic>
+              </a:graphicData>
+            </a:graphic>
+          </wp:inline>
+        </w:drawing>
+      </w:r>
+    </w:p>
     <w:p>
       <w:pPr>
         <w:jc w:val="center"/>
@@ -627,6 +900,45 @@
         <w:jc w:val="center"/>
       </w:pPr>
       <w:r>
+        <w:drawing>
+          <wp:inline xmlns:a="http://schemas.openxmlformats.org/drawingml/2006/main" xmlns:pic="http://schemas.openxmlformats.org/drawingml/2006/picture">
+            <wp:extent cx="5486400" cy="3135086"/>
+            <wp:docPr id="8" name="Picture 8"/>
+            <wp:cNvGraphicFramePr>
+              <a:graphicFrameLocks noChangeAspect="1"/>
+            </wp:cNvGraphicFramePr>
+            <a:graphic>
+              <a:graphicData uri="http://schemas.openxmlformats.org/drawingml/2006/picture">
+                <pic:pic>
+                  <pic:nvPicPr>
+                    <pic:cNvPr id="0" name="fig_sensitivity_state.png"/>
+                    <pic:cNvPicPr/>
+                  </pic:nvPicPr>
+                  <pic:blipFill>
+                    <a:blip r:embed="rId16"/>
+                    <a:stretch>
+                      <a:fillRect/>
+                    </a:stretch>
+                  </pic:blipFill>
+                  <pic:spPr>
+                    <a:xfrm>
+                      <a:off x="0" y="0"/>
+                      <a:ext cx="5486400" cy="3135086"/>
+                    </a:xfrm>
+                    <a:prstGeom prst="rect"/>
+                  </pic:spPr>
+                </pic:pic>
+              </a:graphicData>
+            </a:graphic>
+          </wp:inline>
+        </w:drawing>
+      </w:r>
+    </w:p>
+    <w:p>
+      <w:pPr>
+        <w:jc w:val="center"/>
+      </w:pPr>
+      <w:r>
         <w:rPr>
           <w:i/>
           <w:color w:val="898781"/>
@@ -636,6 +948,45 @@
       </w:r>
     </w:p>
     <w:p/>
+    <w:p>
+      <w:pPr>
+        <w:jc w:val="center"/>
+      </w:pPr>
+      <w:r>
+        <w:drawing>
+          <wp:inline xmlns:a="http://schemas.openxmlformats.org/drawingml/2006/main" xmlns:pic="http://schemas.openxmlformats.org/drawingml/2006/picture">
+            <wp:extent cx="5486400" cy="3135086"/>
+            <wp:docPr id="9" name="Picture 9"/>
+            <wp:cNvGraphicFramePr>
+              <a:graphicFrameLocks noChangeAspect="1"/>
+            </wp:cNvGraphicFramePr>
+            <a:graphic>
+              <a:graphicData uri="http://schemas.openxmlformats.org/drawingml/2006/picture">
+                <pic:pic>
+                  <pic:nvPicPr>
+                    <pic:cNvPr id="0" name="fig_sensitivity_los.png"/>
+                    <pic:cNvPicPr/>
+                  </pic:nvPicPr>
+                  <pic:blipFill>
+                    <a:blip r:embed="rId17"/>
+                    <a:stretch>
+                      <a:fillRect/>
+                    </a:stretch>
+                  </pic:blipFill>
+                  <pic:spPr>
+                    <a:xfrm>
+                      <a:off x="0" y="0"/>
+                      <a:ext cx="5486400" cy="3135086"/>
+                    </a:xfrm>
+                    <a:prstGeom prst="rect"/>
+                  </pic:spPr>
+                </pic:pic>
+              </a:graphicData>
+            </a:graphic>
+          </wp:inline>
+        </w:drawing>
+      </w:r>
+    </w:p>
     <w:p>
       <w:pPr>
         <w:jc w:val="center"/>

</xml_diff>